<commit_message>
Movil como el GR05 con imagen; README, LEEME, diagramas de login y clases, ERS, ECUD y manual actualizados (intentos en el servidor, monster69)
</commit_message>
<xml_diff>
--- a/01. UML/01. ERS/ERS_CONVERSION_UNIDADES_SOAP_DOTNET_GRXX.docx
+++ b/01. UML/01. ERS/ERS_CONVERSION_UNIDADES_SOAP_DOTNET_GRXX.docx
@@ -93,6 +93,19 @@
     </w:p>
     <w:p>
       <w:pPr>
+        <w:spacing w:after="400"/>
+        <w:jc w:val="center"/>
+      </w:pPr>
+      <w:r>
+        <w:rPr>
+          <w:sz w:val="22"/>
+          <w:szCs w:val="22"/>
+        </w:rPr>
+        <w:t xml:space="preserve">PAO 2026-51 · NRC 36884 · Grupo 1</w:t>
+      </w:r>
+    </w:p>
+    <w:p>
+      <w:pPr>
         <w:spacing w:after="80"/>
         <w:jc w:val="center"/>
       </w:pPr>
@@ -117,7 +130,7 @@
           <w:sz w:val="24"/>
           <w:szCs w:val="24"/>
         </w:rPr>
-        <w:t xml:space="preserve">[APELLIDOS NOMBRES INTEGRANTE 1]</w:t>
+        <w:t xml:space="preserve">Buestan Wilmer</w:t>
       </w:r>
     </w:p>
     <w:p>
@@ -130,7 +143,7 @@
           <w:sz w:val="24"/>
           <w:szCs w:val="24"/>
         </w:rPr>
-        <w:t xml:space="preserve">[APELLIDOS NOMBRES INTEGRANTE 2]</w:t>
+        <w:t xml:space="preserve">Masapanta Jefferson</w:t>
       </w:r>
     </w:p>
     <w:p>
@@ -143,7 +156,7 @@
           <w:sz w:val="24"/>
           <w:szCs w:val="24"/>
         </w:rPr>
-        <w:t xml:space="preserve">[APELLIDOS NOMBRES INTEGRANTE 3]</w:t>
+        <w:t xml:space="preserve">Benalcazar Moises</w:t>
       </w:r>
     </w:p>
     <w:p>
@@ -240,7 +253,7 @@
           <w:sz w:val="24"/>
           <w:szCs w:val="24"/>
         </w:rPr>
-        <w:t xml:space="preserve">17/10/2026</w:t>
+        <w:t xml:space="preserve">28/10/2026</w:t>
       </w:r>
     </w:p>
     <w:p>
@@ -331,7 +344,7 @@
         <w:spacing w:after="60" w:line="276"/>
       </w:pPr>
       <w:r>
-        <w:t xml:space="preserve">Cliente de consola (CLICON), cliente de escritorio Windows Forms (CLIESC), cliente web ASP.NET Core MVC (CLIWEB) y cliente móvil Android en Kotlin (CLIMOV).</w:t>
+        <w:t xml:space="preserve">Cliente de consola (CLICON), cliente de escritorio Windows Forms (CLIESC), cliente web ASP.NET Core MVC (CLIWEB) y cliente móvil Android en .NET MAUI, sucesor de Xamarin (CLIMOV).</w:t>
       </w:r>
     </w:p>
     <w:p>
@@ -1508,7 +1521,7 @@
         <w:spacing w:after="60" w:line="276"/>
       </w:pPr>
       <w:r>
-        <w:t xml:space="preserve">Android Developers, documentación de HttpURLConnection y XmlPullParser.</w:t>
+        <w:t xml:space="preserve">Microsoft Learn, documentación de .NET MAUI y HttpClient.</w:t>
       </w:r>
     </w:p>
     <w:p>
@@ -1574,144 +1587,9 @@
       <w:r>
         <w:drawing>
           <wp:inline distT="0" distB="0" distL="0" distR="0">
-            <wp:extent cx="5715000" cy="4838700"/>
+            <wp:extent cx="5715000" cy="5200650"/>
             <wp:effectExtent t="0" r="0" b="0" l="0"/>
             <wp:docPr id="1" name="DArq_Conversor_Unidades.png" descr="Arquitectura general del sistema." title="Arquitectura general del sistema."/>
-            <wp:cNvGraphicFramePr>
-              <a:graphicFrameLocks xmlns:a="http://schemas.openxmlformats.org/drawingml/2006/main" noChangeAspect="1"/>
-            </wp:cNvGraphicFramePr>
-            <a:graphic xmlns:a="http://schemas.openxmlformats.org/drawingml/2006/main">
-              <a:graphicData uri="http://schemas.openxmlformats.org/drawingml/2006/picture">
-                <pic:pic xmlns:pic="http://schemas.openxmlformats.org/drawingml/2006/picture">
-                  <pic:nvPicPr>
-                    <pic:cNvPr id="0" name="" descr=""/>
-                    <pic:cNvPicPr>
-                      <a:picLocks noChangeAspect="1" noChangeArrowheads="1"/>
-                    </pic:cNvPicPr>
-                  </pic:nvPicPr>
-                  <pic:blipFill>
-                    <a:blip r:embed="rId8" cstate="none"/>
-                    <a:srcRect/>
-                    <a:stretch>
-                      <a:fillRect/>
-                    </a:stretch>
-                  </pic:blipFill>
-                  <pic:spPr bwMode="auto">
-                    <a:xfrm>
-                      <a:off x="0" y="0"/>
-                      <a:ext cx="5715000" cy="4838700"/>
-                    </a:xfrm>
-                    <a:prstGeom prst="rect">
-                      <a:avLst/>
-                    </a:prstGeom>
-                  </pic:spPr>
-                </pic:pic>
-              </a:graphicData>
-            </a:graphic>
-          </wp:inline>
-        </w:drawing>
-      </w:r>
-    </w:p>
-    <w:p>
-      <w:pPr>
-        <w:spacing w:after="240"/>
-        <w:jc w:val="center"/>
-      </w:pPr>
-      <w:r>
-        <w:rPr>
-          <w:i/>
-          <w:iCs/>
-          <w:color w:val="555555"/>
-          <w:sz w:val="18"/>
-          <w:szCs w:val="18"/>
-        </w:rPr>
-        <w:t xml:space="preserve">Figura 1. Arquitectura general del sistema.</w:t>
-      </w:r>
-    </w:p>
-    <w:p>
-      <w:pPr>
-        <w:pStyle w:val="Heading2"/>
-      </w:pPr>
-      <w:r>
-        <w:t xml:space="preserve">7.2 Funciones del Producto (software)</w:t>
-      </w:r>
-    </w:p>
-    <w:p>
-      <w:pPr>
-        <w:pStyle w:val="ListParagraph"/>
-        <w:numPr>
-          <w:ilvl w:val="0"/>
-          <w:numId w:val="2"/>
-        </w:numPr>
-        <w:spacing w:after="60" w:line="276"/>
-      </w:pPr>
-      <w:r>
-        <w:t xml:space="preserve">Ingresar al sistema con usuario y clave validados por el servidor.</w:t>
-      </w:r>
-    </w:p>
-    <w:p>
-      <w:pPr>
-        <w:pStyle w:val="ListParagraph"/>
-        <w:numPr>
-          <w:ilvl w:val="0"/>
-          <w:numId w:val="2"/>
-        </w:numPr>
-        <w:spacing w:after="60" w:line="276"/>
-      </w:pPr>
-      <w:r>
-        <w:t xml:space="preserve">Convertir temperatura, longitud y masa (16 conversiones).</w:t>
-      </w:r>
-    </w:p>
-    <w:p>
-      <w:pPr>
-        <w:pStyle w:val="ListParagraph"/>
-        <w:numPr>
-          <w:ilvl w:val="0"/>
-          <w:numId w:val="2"/>
-        </w:numPr>
-        <w:spacing w:after="60" w:line="276"/>
-      </w:pPr>
-      <w:r>
-        <w:t xml:space="preserve">Validar los valores y mostrar mensajes de error claros.</w:t>
-      </w:r>
-    </w:p>
-    <w:p>
-      <w:pPr>
-        <w:pStyle w:val="ListParagraph"/>
-        <w:numPr>
-          <w:ilvl w:val="0"/>
-          <w:numId w:val="2"/>
-        </w:numPr>
-        <w:spacing w:after="60" w:line="276"/>
-      </w:pPr>
-      <w:r>
-        <w:t xml:space="preserve">Intercambiar unidades, consultar el historial de la sesión y cerrar sesión.</w:t>
-      </w:r>
-    </w:p>
-    <w:p>
-      <w:pPr>
-        <w:pStyle w:val="ListParagraph"/>
-        <w:numPr>
-          <w:ilvl w:val="0"/>
-          <w:numId w:val="2"/>
-        </w:numPr>
-        <w:spacing w:after="60" w:line="276"/>
-      </w:pPr>
-      <w:r>
-        <w:t xml:space="preserve">Configurar la dirección del servidor sin recompilar.</w:t>
-      </w:r>
-    </w:p>
-    <w:p>
-      <w:pPr>
-        <w:spacing w:before="120"/>
-        <w:jc w:val="center"/>
-      </w:pPr>
-      <w:r>
-        <w:drawing>
-          <wp:inline distT="0" distB="0" distL="0" distR="0">
-            <wp:extent cx="5715000" cy="4105275"/>
-            <wp:effectExtent t="0" r="0" b="0" l="0"/>
-            <wp:docPr id="1" name="DCU_Conversor_Unidades.png" descr="Diagrama de casos de uso." title="Diagrama de casos de uso."/>
             <wp:cNvGraphicFramePr>
               <a:graphicFrameLocks xmlns:a="http://schemas.openxmlformats.org/drawingml/2006/main" noChangeAspect="1"/>
             </wp:cNvGraphicFramePr>
@@ -1734,6 +1612,141 @@
                   <pic:spPr bwMode="auto">
                     <a:xfrm>
                       <a:off x="0" y="0"/>
+                      <a:ext cx="5715000" cy="5200650"/>
+                    </a:xfrm>
+                    <a:prstGeom prst="rect">
+                      <a:avLst/>
+                    </a:prstGeom>
+                  </pic:spPr>
+                </pic:pic>
+              </a:graphicData>
+            </a:graphic>
+          </wp:inline>
+        </w:drawing>
+      </w:r>
+    </w:p>
+    <w:p>
+      <w:pPr>
+        <w:spacing w:after="240"/>
+        <w:jc w:val="center"/>
+      </w:pPr>
+      <w:r>
+        <w:rPr>
+          <w:i/>
+          <w:iCs/>
+          <w:color w:val="555555"/>
+          <w:sz w:val="18"/>
+          <w:szCs w:val="18"/>
+        </w:rPr>
+        <w:t xml:space="preserve">Figura 1. Arquitectura general del sistema.</w:t>
+      </w:r>
+    </w:p>
+    <w:p>
+      <w:pPr>
+        <w:pStyle w:val="Heading2"/>
+      </w:pPr>
+      <w:r>
+        <w:t xml:space="preserve">7.2 Funciones del Producto (software)</w:t>
+      </w:r>
+    </w:p>
+    <w:p>
+      <w:pPr>
+        <w:pStyle w:val="ListParagraph"/>
+        <w:numPr>
+          <w:ilvl w:val="0"/>
+          <w:numId w:val="2"/>
+        </w:numPr>
+        <w:spacing w:after="60" w:line="276"/>
+      </w:pPr>
+      <w:r>
+        <w:t xml:space="preserve">Ingresar al sistema con usuario y clave validados por el servidor.</w:t>
+      </w:r>
+    </w:p>
+    <w:p>
+      <w:pPr>
+        <w:pStyle w:val="ListParagraph"/>
+        <w:numPr>
+          <w:ilvl w:val="0"/>
+          <w:numId w:val="2"/>
+        </w:numPr>
+        <w:spacing w:after="60" w:line="276"/>
+      </w:pPr>
+      <w:r>
+        <w:t xml:space="preserve">Convertir temperatura, longitud y masa (16 conversiones).</w:t>
+      </w:r>
+    </w:p>
+    <w:p>
+      <w:pPr>
+        <w:pStyle w:val="ListParagraph"/>
+        <w:numPr>
+          <w:ilvl w:val="0"/>
+          <w:numId w:val="2"/>
+        </w:numPr>
+        <w:spacing w:after="60" w:line="276"/>
+      </w:pPr>
+      <w:r>
+        <w:t xml:space="preserve">Validar los valores y mostrar mensajes de error claros.</w:t>
+      </w:r>
+    </w:p>
+    <w:p>
+      <w:pPr>
+        <w:pStyle w:val="ListParagraph"/>
+        <w:numPr>
+          <w:ilvl w:val="0"/>
+          <w:numId w:val="2"/>
+        </w:numPr>
+        <w:spacing w:after="60" w:line="276"/>
+      </w:pPr>
+      <w:r>
+        <w:t xml:space="preserve">Intercambiar unidades, consultar el historial de la sesión y cerrar sesión.</w:t>
+      </w:r>
+    </w:p>
+    <w:p>
+      <w:pPr>
+        <w:pStyle w:val="ListParagraph"/>
+        <w:numPr>
+          <w:ilvl w:val="0"/>
+          <w:numId w:val="2"/>
+        </w:numPr>
+        <w:spacing w:after="60" w:line="276"/>
+      </w:pPr>
+      <w:r>
+        <w:t xml:space="preserve">Configurar la dirección del servidor sin recompilar.</w:t>
+      </w:r>
+    </w:p>
+    <w:p>
+      <w:pPr>
+        <w:spacing w:before="120"/>
+        <w:jc w:val="center"/>
+      </w:pPr>
+      <w:r>
+        <w:drawing>
+          <wp:inline distT="0" distB="0" distL="0" distR="0">
+            <wp:extent cx="5715000" cy="4105275"/>
+            <wp:effectExtent t="0" r="0" b="0" l="0"/>
+            <wp:docPr id="2" name="DCU_Conversor_Unidades.png" descr="Diagrama de casos de uso." title="Diagrama de casos de uso."/>
+            <wp:cNvGraphicFramePr>
+              <a:graphicFrameLocks xmlns:a="http://schemas.openxmlformats.org/drawingml/2006/main" noChangeAspect="1"/>
+            </wp:cNvGraphicFramePr>
+            <a:graphic xmlns:a="http://schemas.openxmlformats.org/drawingml/2006/main">
+              <a:graphicData uri="http://schemas.openxmlformats.org/drawingml/2006/picture">
+                <pic:pic xmlns:pic="http://schemas.openxmlformats.org/drawingml/2006/picture">
+                  <pic:nvPicPr>
+                    <pic:cNvPr id="0" name="" descr=""/>
+                    <pic:cNvPicPr>
+                      <a:picLocks noChangeAspect="1" noChangeArrowheads="1"/>
+                    </pic:cNvPicPr>
+                  </pic:nvPicPr>
+                  <pic:blipFill>
+                    <a:blip r:embed="rId10" cstate="none"/>
+                    <a:srcRect/>
+                    <a:stretch>
+                      <a:fillRect/>
+                    </a:stretch>
+                  </pic:blipFill>
+                  <pic:spPr bwMode="auto">
+                    <a:xfrm>
+                      <a:off x="0" y="0"/>
                       <a:ext cx="5715000" cy="4105275"/>
                     </a:xfrm>
                     <a:prstGeom prst="rect">
@@ -2113,7 +2126,7 @@
                 <w:sz w:val="20"/>
                 <w:szCs w:val="20"/>
               </w:rPr>
-              <w:t xml:space="preserve">Android 7.0 (API 24) o superior, emulador o teléfono en la misma red que el servidor.</w:t>
+              <w:t xml:space="preserve">Android 7.0 (API 24) o superior, celular o tablet real en la misma red WiFi que el servidor publicado en IIS.</w:t>
             </w:r>
           </w:p>
         </w:tc>
@@ -2177,7 +2190,7 @@
                 <w:sz w:val="20"/>
                 <w:szCs w:val="20"/>
               </w:rPr>
-              <w:t xml:space="preserve">Visual Studio 2022 y Android Studio.</w:t>
+              <w:t xml:space="preserve">Visual Studio 2022 (ASP.NET y web, escritorio .NET y .NET MAUI).</w:t>
             </w:r>
           </w:p>
         </w:tc>
@@ -2744,7 +2757,7 @@
                 <w:sz w:val="20"/>
                 <w:szCs w:val="20"/>
               </w:rPr>
-              <w:t xml:space="preserve">Después de 3 intentos fallidos el cliente debe bloquear el ingreso e informar al usuario.</w:t>
+              <w:t xml:space="preserve">El servidor cuenta los intentos fallidos por usuario: informa los intentos restantes y, al tercero, bloquea al usuario 2 minutos. Los clientes solo muestran el mensaje.</w:t>
             </w:r>
           </w:p>
         </w:tc>
@@ -4793,7 +4806,7 @@
                 <w:sz w:val="20"/>
                 <w:szCs w:val="20"/>
               </w:rPr>
-              <w:t xml:space="preserve">Servidor en capas (Contratos, Servicios, Lógica) y clientes con patrón MVC. Las conversiones se definen en un catálogo; agregar una es una línea de código.</w:t>
+              <w:t xml:space="preserve">Servidor en capas (Contratos, Servicios, Lógica), clientes con patrón MVC y patrón Singleton en el autenticador del servidor y en el cliente SOAP de cada aplicación. Las conversiones se definen en un catálogo; agregar una es una línea de código.</w:t>
             </w:r>
           </w:p>
         </w:tc>
@@ -5761,8 +5774,41 @@
 </w:document>
 </file>
 
-<file path=word/comments.xml><?xml version="1.0" encoding="utf-8"?>
-<w:comments xmlns:cx="http://schemas.microsoft.com/office/drawing/2014/chartex" xmlns:cx1="http://schemas.microsoft.com/office/drawing/2015/9/8/chartex" xmlns:cx2="http://schemas.microsoft.com/office/drawing/2015/10/21/chartex" xmlns:cx3="http://schemas.microsoft.com/office/drawing/2016/5/9/chartex" xmlns:cx4="http://schemas.microsoft.com/office/drawing/2016/5/10/chartex" xmlns:cx5="http://schemas.microsoft.com/office/drawing/2016/5/11/chartex" xmlns:cx6="http://schemas.microsoft.com/office/drawing/2016/5/12/chartex" xmlns:cx7="http://schemas.microsoft.com/office/drawing/2016/5/13/chartex" xmlns:cx8="http://schemas.microsoft.com/office/drawing/2016/5/14/chartex" xmlns:mc="http://schemas.openxmlformats.org/markup-compatibility/2006" xmlns:aink="http://schemas.microsoft.com/office/drawing/2016/ink" xmlns:am3d="http://schemas.microsoft.com/office/drawing/2017/model3d" xmlns:o="urn:schemas-microsoft-com:office:office" xmlns:r="http://schemas.openxmlformats.org/officeDocument/2006/relationships" xmlns:m="http://schemas.openxmlformats.org/officeDocument/2006/math" xmlns:v="urn:schemas-microsoft-com:vml" xmlns:wp14="http://schemas.microsoft.com/office/word/2010/wordprocessingDrawing" xmlns:wp="http://schemas.openxmlformats.org/drawingml/2006/wordprocessingDrawing" xmlns:w10="urn:schemas-microsoft-com:office:word" xmlns:w="http://schemas.openxmlformats.org/wordprocessingml/2006/main" xmlns:w14="http://schemas.microsoft.com/office/word/2010/wordml" xmlns:w15="http://schemas.microsoft.com/office/word/2012/wordml" xmlns:w16cex="http://schemas.microsoft.com/office/word/2018/wordml/cex" xmlns:w16cid="http://schemas.microsoft.com/office/word/2016/wordml/cid" xmlns:w16="http://schemas.microsoft.com/office/word/2018/wordml" xmlns:w16sdtdh="http://schemas.microsoft.com/office/word/2020/wordml/sdtdatahash" xmlns:w16se="http://schemas.microsoft.com/office/word/2015/wordml/symex" xmlns:wpg="http://schemas.microsoft.com/office/word/2010/wordprocessingGroup" xmlns:wpi="http://schemas.microsoft.com/office/word/2010/wordprocessingInk" xmlns:wne="http://schemas.microsoft.com/office/word/2006/wordml" xmlns:wps="http://schemas.microsoft.com/office/word/2010/wordprocessingShape"/>
+<file path=word/endnotes.xml><?xml version="1.0" encoding="utf-8"?>
+<w:endnotes xmlns:wpc="http://schemas.microsoft.com/office/word/2010/wordprocessingCanvas" xmlns:mc="http://schemas.openxmlformats.org/markup-compatibility/2006" xmlns:o="urn:schemas-microsoft-com:office:office" xmlns:r="http://schemas.openxmlformats.org/officeDocument/2006/relationships" xmlns:m="http://schemas.openxmlformats.org/officeDocument/2006/math" xmlns:v="urn:schemas-microsoft-com:vml" xmlns:wp14="http://schemas.microsoft.com/office/word/2010/wordprocessingDrawing" xmlns:wp="http://schemas.openxmlformats.org/drawingml/2006/wordprocessingDrawing" xmlns:w10="urn:schemas-microsoft-com:office:word" xmlns:w="http://schemas.openxmlformats.org/wordprocessingml/2006/main" xmlns:w14="http://schemas.microsoft.com/office/word/2010/wordml" xmlns:w15="http://schemas.microsoft.com/office/word/2012/wordml" xmlns:wpg="http://schemas.microsoft.com/office/word/2010/wordprocessingGroup" xmlns:wpi="http://schemas.microsoft.com/office/word/2010/wordprocessingInk" xmlns:wne="http://schemas.microsoft.com/office/word/2006/wordml" xmlns:wps="http://schemas.microsoft.com/office/word/2010/wordprocessingShape" mc:Ignorable="w14 w15 wp14">
+  <w:endnote w:type="separator" w:id="-1">
+    <w:p>
+      <w:pPr>
+        <w:spacing w:after="0" w:line="240" w:lineRule="auto"/>
+      </w:pPr>
+      <w:r>
+        <w:rPr>
+          <w:rStyle w:val="EndnoteReference"/>
+        </w:rPr>
+        <w:endnoteRef/>
+      </w:r>
+      <w:r>
+        <w:separator/>
+      </w:r>
+    </w:p>
+  </w:endnote>
+  <w:endnote w:type="continuationSeparator" w:id="0">
+    <w:p>
+      <w:pPr>
+        <w:spacing w:after="0" w:line="240" w:lineRule="auto"/>
+      </w:pPr>
+      <w:r>
+        <w:rPr>
+          <w:rStyle w:val="EndnoteReference"/>
+        </w:rPr>
+        <w:endnoteRef/>
+      </w:r>
+      <w:r>
+        <w:continuationSeparator/>
+      </w:r>
+    </w:p>
+  </w:endnote>
+</w:endnotes>
 </file>
 
 <file path=word/footer1.xml><?xml version="1.0" encoding="utf-8"?>
@@ -5786,8 +5832,29 @@
         <w:szCs w:val="18"/>
       </w:rPr>
       <w:fldChar w:fldCharType="begin"/>
+    </w:r>
+    <w:r>
+      <w:rPr>
+        <w:color w:val="777777"/>
+        <w:sz w:val="18"/>
+        <w:szCs w:val="18"/>
+      </w:rPr>
       <w:instrText xml:space="preserve">PAGE</w:instrText>
+    </w:r>
+    <w:r>
+      <w:rPr>
+        <w:color w:val="777777"/>
+        <w:sz w:val="18"/>
+        <w:szCs w:val="18"/>
+      </w:rPr>
       <w:fldChar w:fldCharType="separate"/>
+    </w:r>
+    <w:r>
+      <w:rPr>
+        <w:color w:val="777777"/>
+        <w:sz w:val="18"/>
+        <w:szCs w:val="18"/>
+      </w:rPr>
       <w:fldChar w:fldCharType="end"/>
     </w:r>
   </w:p>
@@ -5853,7 +5920,7 @@
 <w:numbering xmlns:wpc="http://schemas.microsoft.com/office/word/2010/wordprocessingCanvas" xmlns:mc="http://schemas.openxmlformats.org/markup-compatibility/2006" xmlns:o="urn:schemas-microsoft-com:office:office" xmlns:r="http://schemas.openxmlformats.org/officeDocument/2006/relationships" xmlns:m="http://schemas.openxmlformats.org/officeDocument/2006/math" xmlns:v="urn:schemas-microsoft-com:vml" xmlns:wp14="http://schemas.microsoft.com/office/word/2010/wordprocessingDrawing" xmlns:wp="http://schemas.openxmlformats.org/drawingml/2006/wordprocessingDrawing" xmlns:w10="urn:schemas-microsoft-com:office:word" xmlns:w="http://schemas.openxmlformats.org/wordprocessingml/2006/main" xmlns:w14="http://schemas.microsoft.com/office/word/2010/wordml" xmlns:w15="http://schemas.microsoft.com/office/word/2012/wordml" xmlns:wpg="http://schemas.microsoft.com/office/word/2010/wordprocessingGroup" xmlns:wpi="http://schemas.microsoft.com/office/word/2010/wordprocessingInk" xmlns:wne="http://schemas.microsoft.com/office/word/2006/wordml" xmlns:wps="http://schemas.microsoft.com/office/word/2010/wordprocessingShape" mc:Ignorable="w14 w15 wp14">
   <w:abstractNum w:abstractNumId="1" w15:restartNumberingAfterBreak="0">
     <w:multiLevelType w:val="hybridMultilevel"/>
-    <w:lvl w:ilvl="0" w15:tentative="1">
+    <w:lvl w:ilvl="0" w:tentative="1">
       <w:start w:val="1"/>
       <w:numFmt w:val="bullet"/>
       <w:lvlText w:val="●"/>
@@ -5862,7 +5929,7 @@
         <w:ind w:left="720" w:hanging="360"/>
       </w:pPr>
     </w:lvl>
-    <w:lvl w:ilvl="1" w15:tentative="1">
+    <w:lvl w:ilvl="1" w:tentative="1">
       <w:start w:val="1"/>
       <w:numFmt w:val="bullet"/>
       <w:lvlText w:val="○"/>
@@ -5871,7 +5938,7 @@
         <w:ind w:left="1440" w:hanging="360"/>
       </w:pPr>
     </w:lvl>
-    <w:lvl w:ilvl="2" w15:tentative="1">
+    <w:lvl w:ilvl="2" w:tentative="1">
       <w:start w:val="1"/>
       <w:numFmt w:val="bullet"/>
       <w:lvlText w:val="■"/>
@@ -5880,7 +5947,7 @@
         <w:ind w:left="2160" w:hanging="360"/>
       </w:pPr>
     </w:lvl>
-    <w:lvl w:ilvl="3" w15:tentative="1">
+    <w:lvl w:ilvl="3" w:tentative="1">
       <w:start w:val="1"/>
       <w:numFmt w:val="bullet"/>
       <w:lvlText w:val="●"/>
@@ -5889,7 +5956,7 @@
         <w:ind w:left="2880" w:hanging="360"/>
       </w:pPr>
     </w:lvl>
-    <w:lvl w:ilvl="4" w15:tentative="1">
+    <w:lvl w:ilvl="4" w:tentative="1">
       <w:start w:val="1"/>
       <w:numFmt w:val="bullet"/>
       <w:lvlText w:val="○"/>
@@ -5898,7 +5965,7 @@
         <w:ind w:left="3600" w:hanging="360"/>
       </w:pPr>
     </w:lvl>
-    <w:lvl w:ilvl="5" w15:tentative="1">
+    <w:lvl w:ilvl="5" w:tentative="1">
       <w:start w:val="1"/>
       <w:numFmt w:val="bullet"/>
       <w:lvlText w:val="■"/>
@@ -5907,7 +5974,7 @@
         <w:ind w:left="4320" w:hanging="360"/>
       </w:pPr>
     </w:lvl>
-    <w:lvl w:ilvl="6" w15:tentative="1">
+    <w:lvl w:ilvl="6" w:tentative="1">
       <w:start w:val="1"/>
       <w:numFmt w:val="bullet"/>
       <w:lvlText w:val="●"/>
@@ -5916,7 +5983,7 @@
         <w:ind w:left="5040" w:hanging="360"/>
       </w:pPr>
     </w:lvl>
-    <w:lvl w:ilvl="7" w15:tentative="1">
+    <w:lvl w:ilvl="7" w:tentative="1">
       <w:start w:val="1"/>
       <w:numFmt w:val="bullet"/>
       <w:lvlText w:val="●"/>
@@ -5925,7 +5992,7 @@
         <w:ind w:left="5760" w:hanging="360"/>
       </w:pPr>
     </w:lvl>
-    <w:lvl w:ilvl="8" w15:tentative="1">
+    <w:lvl w:ilvl="8" w:tentative="1">
       <w:start w:val="1"/>
       <w:numFmt w:val="bullet"/>
       <w:lvlText w:val="●"/>
@@ -5937,7 +6004,7 @@
   </w:abstractNum>
   <w:abstractNum w:abstractNumId="2" w15:restartNumberingAfterBreak="0">
     <w:multiLevelType w:val="hybridMultilevel"/>
-    <w:lvl w:ilvl="0" w15:tentative="1">
+    <w:lvl w:ilvl="0" w:tentative="1">
       <w:start w:val="1"/>
       <w:numFmt w:val="bullet"/>
       <w:lvlText w:val="•"/>
@@ -5946,7 +6013,7 @@
         <w:ind w:left="720" w:hanging="360"/>
       </w:pPr>
     </w:lvl>
-    <w:lvl w:ilvl="1" w15:tentative="1">
+    <w:lvl w:ilvl="1" w:tentative="1">
       <w:start w:val="1"/>
       <w:numFmt w:val="bullet"/>
       <w:lvlText w:val="◦"/>
@@ -5965,6 +6032,9 @@
   <w:num w:numId="2">
     <w:abstractNumId w:val="2"/>
     <w:lvlOverride w:ilvl="0">
+      <w:startOverride w:val="1"/>
+    </w:lvlOverride>
+    <w:lvlOverride w:ilvl="1">
       <w:startOverride w:val="1"/>
     </w:lvlOverride>
   </w:num>
@@ -5983,6 +6053,25 @@
     </w:rPrDefault>
     <w:pPrDefault/>
   </w:docDefaults>
+  <w:style w:type="paragraph" w:styleId="Normal" w:default="1">
+    <w:name w:val="Normal"/>
+    <w:qFormat/>
+  </w:style>
+  <w:style w:type="table" w:styleId="TableNormal" w:default="true">
+    <w:name w:val="Normal Table"/>
+    <w:uiPriority w:val="99"/>
+    <w:semiHidden/>
+    <w:unhideWhenUsed/>
+    <w:tblPr>
+      <w:tblInd w:type="dxa" w:w="0"/>
+      <w:tblCellMar>
+        <w:top w:type="dxa" w:w="0"/>
+        <w:left w:type="dxa" w:w="108"/>
+        <w:bottom w:type="dxa" w:w="0"/>
+        <w:right w:type="dxa" w:w="108"/>
+      </w:tblCellMar>
+    </w:tblPr>
+  </w:style>
   <w:style w:type="paragraph" w:styleId="Title">
     <w:name w:val="Title"/>
     <w:basedOn w:val="Normal"/>
@@ -5991,39 +6080,6 @@
     <w:rPr>
       <w:sz w:val="56"/>
       <w:szCs w:val="56"/>
-    </w:rPr>
-  </w:style>
-  <w:style w:type="paragraph" w:styleId="Heading1">
-    <w:name w:val="Heading 1"/>
-    <w:basedOn w:val="Normal"/>
-    <w:next w:val="Normal"/>
-    <w:qFormat/>
-    <w:rPr>
-      <w:color w:val="2E74B5"/>
-      <w:sz w:val="32"/>
-      <w:szCs w:val="32"/>
-    </w:rPr>
-  </w:style>
-  <w:style w:type="paragraph" w:styleId="Heading2">
-    <w:name w:val="Heading 2"/>
-    <w:basedOn w:val="Normal"/>
-    <w:next w:val="Normal"/>
-    <w:qFormat/>
-    <w:rPr>
-      <w:color w:val="2E74B5"/>
-      <w:sz w:val="26"/>
-      <w:szCs w:val="26"/>
-    </w:rPr>
-  </w:style>
-  <w:style w:type="paragraph" w:styleId="Heading3">
-    <w:name w:val="Heading 3"/>
-    <w:basedOn w:val="Normal"/>
-    <w:next w:val="Normal"/>
-    <w:qFormat/>
-    <w:rPr>
-      <w:color w:val="1F4D78"/>
-      <w:sz w:val="24"/>
-      <w:szCs w:val="24"/>
     </w:rPr>
   </w:style>
   <w:style w:type="paragraph" w:styleId="Heading4">
@@ -6069,6 +6125,139 @@
     <w:name w:val="List Paragraph"/>
     <w:basedOn w:val="Normal"/>
     <w:qFormat/>
+  </w:style>
+  <w:style w:type="paragraph" w:styleId="Caption">
+    <w:name w:val="caption"/>
+    <w:basedOn w:val="Normal"/>
+    <w:next w:val="Normal"/>
+    <w:uiPriority w:val="35"/>
+    <w:semiHidden/>
+    <w:unhideWhenUsed/>
+    <w:qFormat/>
+    <w:pPr>
+      <w:spacing w:after="200"/>
+    </w:pPr>
+    <w:rPr>
+      <w:i/>
+      <w:iCs/>
+      <w:color w:val="44546A" w:themeColor="dark2"/>
+      <w:sz w:val="18"/>
+      <w:szCs w:val="18"/>
+    </w:rPr>
+  </w:style>
+  <w:style w:type="paragraph" w:styleId="Bibliography">
+    <w:name w:val="Bibliography"/>
+    <w:basedOn w:val="Normal"/>
+    <w:next w:val="Normal"/>
+    <w:uiPriority w:val="37"/>
+    <w:unhideWhenUsed/>
+  </w:style>
+  <w:style w:type="paragraph" w:styleId="TOC1">
+    <w:name w:val="toc 1"/>
+    <w:basedOn w:val="Normal"/>
+    <w:next w:val="Normal"/>
+    <w:uiPriority w:val="39"/>
+    <w:semiHidden/>
+    <w:unhideWhenUsed/>
+    <w:pPr>
+      <w:spacing w:after="100"/>
+    </w:pPr>
+  </w:style>
+  <w:style w:type="paragraph" w:styleId="TOC2">
+    <w:name w:val="toc 2"/>
+    <w:basedOn w:val="Normal"/>
+    <w:next w:val="Normal"/>
+    <w:uiPriority w:val="39"/>
+    <w:semiHidden/>
+    <w:unhideWhenUsed/>
+    <w:pPr>
+      <w:spacing w:after="100"/>
+      <w:ind w:left="220"/>
+    </w:pPr>
+  </w:style>
+  <w:style w:type="paragraph" w:styleId="TOC3">
+    <w:name w:val="toc 3"/>
+    <w:basedOn w:val="Normal"/>
+    <w:next w:val="Normal"/>
+    <w:uiPriority w:val="39"/>
+    <w:semiHidden/>
+    <w:unhideWhenUsed/>
+    <w:pPr>
+      <w:spacing w:after="100"/>
+      <w:ind w:left="440"/>
+    </w:pPr>
+  </w:style>
+  <w:style w:type="paragraph" w:styleId="TOC4">
+    <w:name w:val="toc 4"/>
+    <w:basedOn w:val="Normal"/>
+    <w:next w:val="Normal"/>
+    <w:uiPriority w:val="39"/>
+    <w:semiHidden/>
+    <w:unhideWhenUsed/>
+    <w:pPr>
+      <w:spacing w:after="100"/>
+      <w:ind w:left="660"/>
+    </w:pPr>
+  </w:style>
+  <w:style w:type="paragraph" w:styleId="TOC5">
+    <w:name w:val="toc 5"/>
+    <w:basedOn w:val="Normal"/>
+    <w:next w:val="Normal"/>
+    <w:uiPriority w:val="39"/>
+    <w:semiHidden/>
+    <w:unhideWhenUsed/>
+    <w:pPr>
+      <w:spacing w:after="100"/>
+      <w:ind w:left="880"/>
+    </w:pPr>
+  </w:style>
+  <w:style w:type="paragraph" w:styleId="TOC6">
+    <w:name w:val="toc 6"/>
+    <w:basedOn w:val="Normal"/>
+    <w:next w:val="Normal"/>
+    <w:uiPriority w:val="39"/>
+    <w:semiHidden/>
+    <w:unhideWhenUsed/>
+    <w:pPr>
+      <w:spacing w:after="100"/>
+      <w:ind w:left="1100"/>
+    </w:pPr>
+  </w:style>
+  <w:style w:type="paragraph" w:styleId="TOC7">
+    <w:name w:val="toc 7"/>
+    <w:basedOn w:val="Normal"/>
+    <w:next w:val="Normal"/>
+    <w:uiPriority w:val="39"/>
+    <w:semiHidden/>
+    <w:unhideWhenUsed/>
+    <w:pPr>
+      <w:spacing w:after="100"/>
+      <w:ind w:left="1320"/>
+    </w:pPr>
+  </w:style>
+  <w:style w:type="paragraph" w:styleId="TOC8">
+    <w:name w:val="toc 8"/>
+    <w:basedOn w:val="Normal"/>
+    <w:next w:val="Normal"/>
+    <w:uiPriority w:val="39"/>
+    <w:semiHidden/>
+    <w:unhideWhenUsed/>
+    <w:pPr>
+      <w:spacing w:after="100"/>
+      <w:ind w:left="1540"/>
+    </w:pPr>
+  </w:style>
+  <w:style w:type="paragraph" w:styleId="TOC9">
+    <w:name w:val="toc 9"/>
+    <w:basedOn w:val="Normal"/>
+    <w:next w:val="Normal"/>
+    <w:uiPriority w:val="39"/>
+    <w:semiHidden/>
+    <w:unhideWhenUsed/>
+    <w:pPr>
+      <w:spacing w:after="100"/>
+      <w:ind w:left="1760"/>
+    </w:pPr>
   </w:style>
   <w:style w:type="character" w:styleId="Hyperlink">
     <w:name w:val="Hyperlink"/>
@@ -6117,6 +6306,50 @@
       <w:szCs w:val="20"/>
     </w:rPr>
   </w:style>
+  <w:style w:type="character" w:styleId="EndnoteReference">
+    <w:name w:val="endnote reference"/>
+    <w:basedOn w:val="DefaultParagraphFont"/>
+    <w:uiPriority w:val="99"/>
+    <w:semiHidden/>
+    <w:unhideWhenUsed/>
+    <w:rPr>
+      <w:vertAlign w:val="superscript"/>
+    </w:rPr>
+  </w:style>
+  <w:style w:type="paragraph" w:styleId="EndnoteText">
+    <w:name w:val="endnote text"/>
+    <w:basedOn w:val="Normal"/>
+    <w:link w:val="EndnoteTextChar"/>
+    <w:uiPriority w:val="99"/>
+    <w:semiHidden/>
+    <w:unhideWhenUsed/>
+    <w:pPr>
+      <w:spacing w:after="0" w:line="240" w:lineRule="auto"/>
+    </w:pPr>
+    <w:rPr>
+      <w:sz w:val="20"/>
+      <w:szCs w:val="20"/>
+    </w:rPr>
+  </w:style>
+  <w:style w:type="character" w:styleId="EndnoteTextChar">
+    <w:name w:val="Endnote Text Char"/>
+    <w:basedOn w:val="DefaultParagraphFont"/>
+    <w:link w:val="EndnoteText"/>
+    <w:uiPriority w:val="99"/>
+    <w:semiHidden/>
+    <w:unhideWhenUsed/>
+    <w:rPr>
+      <w:sz w:val="20"/>
+      <w:szCs w:val="20"/>
+    </w:rPr>
+  </w:style>
+  <w:style w:type="character" w:styleId="LineNumber">
+    <w:name w:val="line number"/>
+    <w:basedOn w:val="DefaultParagraphFont"/>
+    <w:uiPriority w:val="99"/>
+    <w:semiHidden/>
+    <w:unhideWhenUsed/>
+  </w:style>
   <w:style w:type="paragraph" w:styleId="Heading1">
     <w:name w:val="Heading 1"/>
     <w:basedOn w:val="Normal"/>
@@ -6126,7 +6359,7 @@
       <w:pBdr>
         <w:bottom w:val="single" w:color="006950" w:sz="6" w:space="4"/>
       </w:pBdr>
-      <w:spacing w:before="360" w:after="160"/>
+      <w:spacing w:after="160" w:before="360"/>
       <w:outlineLvl w:val="0"/>
     </w:pPr>
     <w:rPr>
@@ -6144,7 +6377,7 @@
     <w:next w:val="Normal"/>
     <w:qFormat/>
     <w:pPr>
-      <w:spacing w:before="240" w:after="120"/>
+      <w:spacing w:after="120" w:before="240"/>
       <w:outlineLvl w:val="1"/>
     </w:pPr>
     <w:rPr>
@@ -6156,5 +6389,313 @@
       <w:szCs w:val="25"/>
     </w:rPr>
   </w:style>
+  <w:style w:type="paragraph" w:styleId="Heading3">
+    <w:name w:val="Heading 3"/>
+    <w:basedOn w:val="Normal"/>
+    <w:next w:val="Normal"/>
+    <w:qFormat/>
+    <w:pPr>
+      <w:spacing w:after="100" w:before="200"/>
+      <w:outlineLvl w:val="2"/>
+    </w:pPr>
+    <w:rPr>
+      <w:rFonts w:ascii="Calibri" w:cs="Calibri" w:eastAsia="Calibri" w:hAnsi="Calibri"/>
+      <w:b/>
+      <w:bCs/>
+      <w:color w:val="333333"/>
+      <w:sz w:val="23"/>
+      <w:szCs w:val="23"/>
+    </w:rPr>
+  </w:style>
 </w:styles>
+</file>
+
+<file path=word/theme/theme1.xml><?xml version="1.0" encoding="utf-8"?>
+<a:theme xmlns:a="http://schemas.openxmlformats.org/drawingml/2006/main" name="Office Theme">
+  <a:themeElements>
+    <a:clrScheme name="Office">
+      <a:dk1>
+        <a:sysClr val="windowText" lastClr="000000"/>
+      </a:dk1>
+      <a:lt1>
+        <a:sysClr val="window" lastClr="FFFFFF"/>
+      </a:lt1>
+      <a:dk2>
+        <a:srgbClr val="44546A"/>
+      </a:dk2>
+      <a:lt2>
+        <a:srgbClr val="E7E6E6"/>
+      </a:lt2>
+      <a:accent1>
+        <a:srgbClr val="4472C4"/>
+      </a:accent1>
+      <a:accent2>
+        <a:srgbClr val="ED7D31"/>
+      </a:accent2>
+      <a:accent3>
+        <a:srgbClr val="A5A5A5"/>
+      </a:accent3>
+      <a:accent4>
+        <a:srgbClr val="FFC000"/>
+      </a:accent4>
+      <a:accent5>
+        <a:srgbClr val="5B9BD5"/>
+      </a:accent5>
+      <a:accent6>
+        <a:srgbClr val="70AD47"/>
+      </a:accent6>
+      <a:hlink>
+        <a:srgbClr val="0563C1"/>
+      </a:hlink>
+      <a:folHlink>
+        <a:srgbClr val="954F72"/>
+      </a:folHlink>
+    </a:clrScheme>
+    <a:fontScheme name="Office">
+      <a:majorFont>
+        <a:latin typeface="Calibri Light" panose="020F0302020204030204"/>
+        <a:ea typeface=""/>
+        <a:cs typeface=""/>
+        <a:font script="Jpan" typeface="游ゴシック Light"/>
+        <a:font script="Hang" typeface="맑은 고딕"/>
+        <a:font script="Hans" typeface="等线 Light"/>
+        <a:font script="Hant" typeface="新細明體"/>
+        <a:font script="Arab" typeface="Times New Roman"/>
+        <a:font script="Hebr" typeface="Times New Roman"/>
+        <a:font script="Thai" typeface="Angsana New"/>
+        <a:font script="Ethi" typeface="Nyala"/>
+        <a:font script="Beng" typeface="Vrinda"/>
+        <a:font script="Gujr" typeface="Shruti"/>
+        <a:font script="Khmr" typeface="MoolBoran"/>
+        <a:font script="Knda" typeface="Tunga"/>
+        <a:font script="Guru" typeface="Raavi"/>
+        <a:font script="Cans" typeface="Euphemia"/>
+        <a:font script="Cher" typeface="Plantagenet Cherokee"/>
+        <a:font script="Yiii" typeface="Microsoft Yi Baiti"/>
+        <a:font script="Tibt" typeface="Microsoft Himalaya"/>
+        <a:font script="Thaa" typeface="MV Boli"/>
+        <a:font script="Deva" typeface="Mangal"/>
+        <a:font script="Telu" typeface="Gautami"/>
+        <a:font script="Taml" typeface="Latha"/>
+        <a:font script="Syrc" typeface="Estrangelo Edessa"/>
+        <a:font script="Orya" typeface="Kalinga"/>
+        <a:font script="Mlym" typeface="Kartika"/>
+        <a:font script="Laoo" typeface="DokChampa"/>
+        <a:font script="Sinh" typeface="Iskoola Pota"/>
+        <a:font script="Mong" typeface="Mongolian Baiti"/>
+        <a:font script="Viet" typeface="Times New Roman"/>
+        <a:font script="Uigh" typeface="Microsoft Uighur"/>
+        <a:font script="Geor" typeface="Sylfaen"/>
+        <a:font script="Armn" typeface="Arial"/>
+        <a:font script="Bugi" typeface="Leelawadee UI"/>
+        <a:font script="Bopo" typeface="Microsoft JhengHei"/>
+        <a:font script="Java" typeface="Javanese Text"/>
+        <a:font script="Lisu" typeface="Segoe UI"/>
+        <a:font script="Mymr" typeface="Myanmar Text"/>
+        <a:font script="Nkoo" typeface="Ebrima"/>
+        <a:font script="Olck" typeface="Nirmala UI"/>
+        <a:font script="Osma" typeface="Ebrima"/>
+        <a:font script="Phag" typeface="Phagspa"/>
+        <a:font script="Syrn" typeface="Estrangelo Edessa"/>
+        <a:font script="Syrj" typeface="Estrangelo Edessa"/>
+        <a:font script="Syre" typeface="Estrangelo Edessa"/>
+        <a:font script="Sora" typeface="Nirmala UI"/>
+        <a:font script="Tale" typeface="Microsoft Tai Le"/>
+        <a:font script="Talu" typeface="Microsoft New Tai Lue"/>
+        <a:font script="Tfng" typeface="Ebrima"/>
+      </a:majorFont>
+      <a:minorFont>
+        <a:latin typeface="Calibri" panose="020F0502020204030204"/>
+        <a:ea typeface=""/>
+        <a:cs typeface=""/>
+        <a:font script="Jpan" typeface="游明朝"/>
+        <a:font script="Hang" typeface="맑은 고딕"/>
+        <a:font script="Hans" typeface="等线"/>
+        <a:font script="Hant" typeface="新細明體"/>
+        <a:font script="Arab" typeface="Arial"/>
+        <a:font script="Hebr" typeface="Arial"/>
+        <a:font script="Thai" typeface="Cordia New"/>
+        <a:font script="Ethi" typeface="Nyala"/>
+        <a:font script="Beng" typeface="Vrinda"/>
+        <a:font script="Gujr" typeface="Shruti"/>
+        <a:font script="Khmr" typeface="DaunPenh"/>
+        <a:font script="Knda" typeface="Tunga"/>
+        <a:font script="Guru" typeface="Raavi"/>
+        <a:font script="Cans" typeface="Euphemia"/>
+        <a:font script="Cher" typeface="Plantagenet Cherokee"/>
+        <a:font script="Yiii" typeface="Microsoft Yi Baiti"/>
+        <a:font script="Tibt" typeface="Microsoft Himalaya"/>
+        <a:font script="Thaa" typeface="MV Boli"/>
+        <a:font script="Deva" typeface="Mangal"/>
+        <a:font script="Telu" typeface="Gautami"/>
+        <a:font script="Taml" typeface="Latha"/>
+        <a:font script="Syrc" typeface="Estrangelo Edessa"/>
+        <a:font script="Orya" typeface="Kalinga"/>
+        <a:font script="Mlym" typeface="Kartika"/>
+        <a:font script="Laoo" typeface="DokChampa"/>
+        <a:font script="Sinh" typeface="Iskoola Pota"/>
+        <a:font script="Mong" typeface="Mongolian Baiti"/>
+        <a:font script="Viet" typeface="Arial"/>
+        <a:font script="Uigh" typeface="Microsoft Uighur"/>
+        <a:font script="Geor" typeface="Sylfaen"/>
+        <a:font script="Armn" typeface="Arial"/>
+        <a:font script="Bugi" typeface="Leelawadee UI"/>
+        <a:font script="Bopo" typeface="Microsoft JhengHei"/>
+        <a:font script="Java" typeface="Javanese Text"/>
+        <a:font script="Lisu" typeface="Segoe UI"/>
+        <a:font script="Mymr" typeface="Myanmar Text"/>
+        <a:font script="Nkoo" typeface="Ebrima"/>
+        <a:font script="Olck" typeface="Nirmala UI"/>
+        <a:font script="Osma" typeface="Ebrima"/>
+        <a:font script="Phag" typeface="Phagspa"/>
+        <a:font script="Syrn" typeface="Estrangelo Edessa"/>
+        <a:font script="Syrj" typeface="Estrangelo Edessa"/>
+        <a:font script="Syre" typeface="Estrangelo Edessa"/>
+        <a:font script="Sora" typeface="Nirmala UI"/>
+        <a:font script="Tale" typeface="Microsoft Tai Le"/>
+        <a:font script="Talu" typeface="Microsoft New Tai Lue"/>
+        <a:font script="Tfng" typeface="Ebrima"/>
+      </a:minorFont>
+    </a:fontScheme>
+    <a:fmtScheme name="Office">
+      <a:fillStyleLst>
+        <a:solidFill>
+          <a:schemeClr val="phClr"/>
+        </a:solidFill>
+        <a:gradFill rotWithShape="true">
+          <a:gsLst>
+            <a:gs pos="0">
+              <a:schemeClr val="phClr">
+                <a:lumMod val="110000"/>
+                <a:satMod val="105000"/>
+                <a:tint val="67000"/>
+              </a:schemeClr>
+            </a:gs>
+            <a:gs pos="50000">
+              <a:schemeClr val="phClr">
+                <a:lumMod val="105000"/>
+                <a:satMod val="103000"/>
+                <a:tint val="73000"/>
+              </a:schemeClr>
+            </a:gs>
+            <a:gs pos="100000">
+              <a:schemeClr val="phClr">
+                <a:lumMod val="105000"/>
+                <a:satMod val="109000"/>
+                <a:tint val="81000"/>
+              </a:schemeClr>
+            </a:gs>
+          </a:gsLst>
+          <a:lin ang="5400000" scaled="false"/>
+        </a:gradFill>
+        <a:gradFill rotWithShape="true">
+          <a:gsLst>
+            <a:gs pos="0">
+              <a:schemeClr val="phClr">
+                <a:satMod val="103000"/>
+                <a:lumMod val="102000"/>
+                <a:tint val="94000"/>
+              </a:schemeClr>
+            </a:gs>
+            <a:gs pos="50000">
+              <a:schemeClr val="phClr">
+                <a:satMod val="110000"/>
+                <a:lumMod val="100000"/>
+                <a:shade val="100000"/>
+              </a:schemeClr>
+            </a:gs>
+            <a:gs pos="100000">
+              <a:schemeClr val="phClr">
+                <a:lumMod val="99000"/>
+                <a:satMod val="120000"/>
+                <a:shade val="78000"/>
+              </a:schemeClr>
+            </a:gs>
+          </a:gsLst>
+          <a:lin ang="5400000" scaled="false"/>
+        </a:gradFill>
+      </a:fillStyleLst>
+      <a:lnStyleLst>
+        <a:ln w="6350" cap="flat" cmpd="sng" algn="ctr">
+          <a:solidFill>
+            <a:schemeClr val="phClr"/>
+          </a:solidFill>
+          <a:prstDash val="solid"/>
+          <a:miter lim="800000"/>
+        </a:ln>
+        <a:ln w="12700" cap="flat" cmpd="sng" algn="ctr">
+          <a:solidFill>
+            <a:schemeClr val="phClr"/>
+          </a:solidFill>
+          <a:prstDash val="solid"/>
+          <a:miter lim="800000"/>
+        </a:ln>
+        <a:ln w="19050" cap="flat" cmpd="sng" algn="ctr">
+          <a:solidFill>
+            <a:schemeClr val="phClr"/>
+          </a:solidFill>
+          <a:prstDash val="solid"/>
+          <a:miter lim="800000"/>
+        </a:ln>
+      </a:lnStyleLst>
+      <a:effectStyleLst>
+        <a:effectStyle>
+          <a:effectLst/>
+        </a:effectStyle>
+        <a:effectStyle>
+          <a:effectLst/>
+        </a:effectStyle>
+        <a:effectStyle>
+          <a:effectLst>
+            <a:outerShdw blurRad="57150" dist="19050" dir="5400000" algn="ctr" rotWithShape="false">
+              <a:srgbClr val="000000">
+                <a:alpha val="63000"/>
+              </a:srgbClr>
+            </a:outerShdw>
+          </a:effectLst>
+        </a:effectStyle>
+      </a:effectStyleLst>
+      <a:bgFillStyleLst>
+        <a:solidFill>
+          <a:schemeClr val="phClr"/>
+        </a:solidFill>
+        <a:solidFill>
+          <a:schemeClr val="phClr">
+            <a:tint val="95000"/>
+            <a:satMod val="170000"/>
+          </a:schemeClr>
+        </a:solidFill>
+        <a:gradFill rotWithShape="true">
+          <a:gsLst>
+            <a:gs pos="0">
+              <a:schemeClr val="phClr">
+                <a:tint val="93000"/>
+                <a:satMod val="150000"/>
+                <a:shade val="98000"/>
+                <a:lumMod val="102000"/>
+              </a:schemeClr>
+            </a:gs>
+            <a:gs pos="50000">
+              <a:schemeClr val="phClr">
+                <a:tint val="98000"/>
+                <a:satMod val="130000"/>
+                <a:shade val="90000"/>
+                <a:lumMod val="103000"/>
+              </a:schemeClr>
+            </a:gs>
+            <a:gs pos="100000">
+              <a:schemeClr val="phClr">
+                <a:shade val="63000"/>
+                <a:satMod val="120000"/>
+              </a:schemeClr>
+            </a:gs>
+          </a:gsLst>
+          <a:lin ang="5400000" scaled="false"/>
+        </a:gradFill>
+      </a:bgFillStyleLst>
+    </a:fmtScheme>
+  </a:themeElements>
+  <a:objectDefaults/>
+  <a:extraClrSchemeLst/>
+</a:theme>
 </file>
</xml_diff>